<commit_message>
Show purchase purpose to the requester
구매 이유 기록은 사용자가 말한 pain point인데 요청자 본인이 볼 곳이 없었다.
purpose는 PurchaseRequest에 저장돼 있고 FIN-REV-01(재정부 검토)과
FIN-LEDGER-01에서만 표시되고 있었다. 재정부는 목적을 보는데 정작 요청자는
자기가 쓴 이유를 다시 확인할 수 없는 상태였다.

FIN-REQ-02 — 요약 카드 아래 구매 목적 전문을 한 블록으로 추가.
MY-REQ-01 — 목록 제목 아래 목적 한 줄. 길면 잘리고 마우스를 올리면 전문.

SPEC_DATA를 함께 갱신했다. FIN-REQ-02에 `요약 카드` 항목을 신설하면서
뒤 항목 번호가 밀려 03~06으로 재번호했다. MY-REQ-01 `요청 목록` 설명에
구매 목적과 노출 방식을 반영. VADA_SCREEN_QA.md 확인 항목 2건도 함께.

AppContext를 export했다. MY-REQ-01은 기본 사용자가 김바다인데 샘플 요청자는
박해랑·김민석·이윤슬뿐이라 기본 렌더가 항상 빈 상태다. 실제 행이 그려지는
상태를 검증하려면 사용자 주입이 필요해 테스트 지원 목적으로 열었다.

테스트 2건 추가 (48 → 50)
- FIN-REQ-02 요약 카드에 구매 목적이 나오는지
- MY-REQ-01에 박해랑을 주입해 행이 그려지고 목적이 붙는지

검증: 빌드 통과 · 테스트 50개 통과 · 화면 3구조 93개 일치 · dev 서버 200

Co-Authored-By: Claude Opus 5 (1M context) <noreply@anthropic.com>
</commit_message>
<xml_diff>
--- a/docs/VADA_SCREEN_QA.docx
+++ b/docs/VADA_SCREEN_QA.docx
@@ -23862,7 +23862,16 @@
               <w:spacing w:after="0"/>
             </w:pPr>
             <w:r>
-              <w:t xml:space="preserve">다음 요소를 각각 한 번씩 확인·수행한다: 상태 요약 카드 · 요청 목록 · 보완하기 · 새 구매 요청</w:t>
+              <w:t xml:space="preserve">다음 요소를 각각 한 번씩 확인·수행한다: 상태 요약 카드 · 요청 목록(</w:t>
+            </w:r>
+            <w:r>
+              <w:rPr>
+                <w:b/>
+              </w:rPr>
+              <w:t xml:space="preserve">제목 아래 구매 목적 한 줄</w:t>
+            </w:r>
+            <w:r>
+              <w:t xml:space="preserve">) · 보완하기 · 새 구매 요청</w:t>
             </w:r>
           </w:p>
         </w:tc>
@@ -25689,7 +25698,16 @@
               <w:spacing w:after="0"/>
             </w:pPr>
             <w:r>
-              <w:t xml:space="preserve">다음 요소를 각각 한 번씩 확인·수행한다: 진행 단계 · 품목별 상태 · 처리 이력</w:t>
+              <w:t xml:space="preserve">다음 요소를 각각 한 번씩 확인·수행한다: 진행 단계 · </w:t>
+            </w:r>
+            <w:r>
+              <w:rPr>
+                <w:b/>
+              </w:rPr>
+              <w:t xml:space="preserve">요약 카드(구매 목적 포함)</w:t>
+            </w:r>
+            <w:r>
+              <w:t xml:space="preserve"> · 품목별 상태 · 처리 이력 · 주문 취소 요청 · 요청 취소(품목 단위)</w:t>
             </w:r>
           </w:p>
         </w:tc>

</xml_diff>

<commit_message>
Compute the request progress step from execution state
진행 단계가 요청 상태만 보고 계산해 두 가지가 틀려 있었다.

반려·요청 취소된 요청이 1단계(재정부 검토)로 그려졌다. 이미 종결된 요청이
검토 중으로 보인다. 단계 막대를 감추고 종결 사유 안내로 대체한다.

4번째 단계 이름이 `결제·증빙`이었다. 증빙은 어제 MVP 제품화에서 뺐다.
`수령·이행`으로 바꿨다.

현재 단계를 승인 품목의 실행분 진행에서 계산하도록 바꿨다. 요청 상태만으로는
주문·배송·수령이 잡히지 않아 승인된 요청이 전부 같은 단계로 보였다.
승인 품목이 없으면 재정부 검토, 실행분이 배송·수령·이행 중이면 수령·이행,
전부 정산 완료면 처리 완료다. getFinanceStageForExecution을 그대로 써서
EVIDENCE_STAGE_ENABLED 스위치와 자동으로 일관된다.

SPEC_DATA 01 진행 단계의 설명·제약과 exceptions, QA FIN-REQ-02-03을 함께
갱신했다.

테스트 4건 추가 (50 → 54). 샘플에 반려·요청 취소 요청이 없어 AppContext로
주입해 확인한다.
- 단계 이름에 `수령·이행`이 있고 `결제·증빙`이 없다
- 검토 대기 요청의 현재 단계가 재정부 검토다
- 반려 요청은 단계 막대 대신 종결 안내를 보여준다
- 요청 취소도 종결로 표시한다

검증: 빌드 통과 · 테스트 54개 통과 · dev 서버 200

Co-Authored-By: Claude Opus 5 (1M context) <noreply@anthropic.com>
</commit_message>
<xml_diff>
--- a/docs/VADA_SCREEN_QA.docx
+++ b/docs/VADA_SCREEN_QA.docx
@@ -25780,7 +25780,13 @@
               <w:spacing w:after="0"/>
             </w:pPr>
             <w:r>
-              <w:t xml:space="preserve">사용자 역할, 데이터 유무, 처리 전후 상태를 바꾸어 제한 조건을 확인한다.</w:t>
+              <w:t xml:space="preserve">사용자 역할, 데이터 유무, 처리 전후 상태를 바꾸어 제한 조건을 확인한다. </w:t>
+            </w:r>
+            <w:r>
+              <w:rPr>
+                <w:b/>
+              </w:rPr>
+              <w:t xml:space="preserve">반려·요청 취소 요청도 함께 연다.</w:t>
             </w:r>
           </w:p>
         </w:tc>
@@ -25800,6 +25806,15 @@
             </w:r>
             <w:r>
               <w:t xml:space="preserve">보완 요청 상태가 아니면 재제출 행동을 노출하지 않는다</w:t>
+            </w:r>
+            <w:r>
+              <w:br/>
+            </w:r>
+            <w:r>
+              <w:rPr>
+                <w:b/>
+              </w:rPr>
+              <w:t xml:space="preserve">반려·요청 취소된 요청은 진행 단계 막대를 표시하지 않고 종결 안내로 대체한다</w:t>
             </w:r>
           </w:p>
         </w:tc>

</xml_diff>